<commit_message>
Registra verificacao de acessibilidade na pagina renderizada no relatorio e README
Co-Authored-By: Claude Opus 5.5 <noreply@anthropic.com>
</commit_message>
<xml_diff>
--- a/docs/relatorio/Plano_de_Acao_PI2.docx
+++ b/docs/relatorio/Plano_de_Acao_PI2.docx
@@ -3872,7 +3872,7 @@
               <w:spacing w:after="0"/>
             </w:pPr>
             <w:r>
-              <w:t>83 testes</w:t>
+              <w:t>86 testes</w:t>
             </w:r>
           </w:p>
         </w:tc>
@@ -7342,13 +7342,13 @@
     <w:rsidRoot w:val="000E3AAA"/>
     <w:rsid w:val="000E3AAA"/>
     <w:rsid w:val="001F4722"/>
+    <w:rsid w:val="00237D13"/>
     <w:rsid w:val="00284ABF"/>
-    <w:rsid w:val="00304D0D"/>
     <w:rsid w:val="00630D15"/>
-    <w:rsid w:val="00841844"/>
     <w:rsid w:val="009F5586"/>
     <w:rsid w:val="00C35DD4"/>
     <w:rsid w:val="00C64ED6"/>
+    <w:rsid w:val="00CD4F4A"/>
     <w:rsid w:val="00CD5ECB"/>
     <w:rsid w:val="00D73A83"/>
   </w:rsids>

</xml_diff>

<commit_message>
Preenche RA no plano de acao
Co-Authored-By: Claude Opus 5.5 <noreply@anthropic.com>
</commit_message>
<xml_diff>
--- a/docs/relatorio/Plano_de_Acao_PI2.docx
+++ b/docs/relatorio/Plano_de_Acao_PI2.docx
@@ -96,7 +96,7 @@
               <w:sdtEndPr/>
               <w:sdtContent>
                 <w:r>
-                  <w:t>Luiz Gustavo Jacobuce Treymann – RA: [preencher]</w:t>
+                  <w:t>Luiz Gustavo Jacobuce Treymann – RA: 24215109</w:t>
                 </w:r>
               </w:sdtContent>
             </w:sdt>
@@ -7342,13 +7342,13 @@
     <w:rsidRoot w:val="000E3AAA"/>
     <w:rsid w:val="000E3AAA"/>
     <w:rsid w:val="001F4722"/>
-    <w:rsid w:val="00237D13"/>
     <w:rsid w:val="00284ABF"/>
     <w:rsid w:val="00630D15"/>
     <w:rsid w:val="009F5586"/>
+    <w:rsid w:val="00B571E4"/>
+    <w:rsid w:val="00C27470"/>
     <w:rsid w:val="00C35DD4"/>
     <w:rsid w:val="00C64ED6"/>
-    <w:rsid w:val="00CD4F4A"/>
     <w:rsid w:val="00CD5ECB"/>
     <w:rsid w:val="00D73A83"/>
   </w:rsids>

</xml_diff>